<commit_message>
feat: add APAP CIIAA interoperability
</commit_message>
<xml_diff>
--- a/templates/openagreements-cc-by-4.0/openagreements-confidentiality-invention-assignment-agreement/template.docx
+++ b/templates/openagreements-cc-by-4.0/openagreements-confidentiality-invention-assignment-agreement/template.docx
@@ -1909,8 +1909,8 @@
       <w:rPr>
         <w:rFonts w:ascii="Arial" w:hAnsi="Arial" w:cs="Arial"/>
         <w:color w:val="494A4B"/>
-        <w:sz w:val="18"/>
-        <w:szCs w:val="18"/>
+        <w:sz w:val="16"/>
+        <w:szCs w:val="16"/>
       </w:rPr>
       <w:t xml:space="preserve">OpenAgreements Confidentiality &amp; Invention Assignment Agreement (CIIAA) (v0.4.0). Free to use under CC BY 4.0</w:t>
     </w:r>
@@ -1921,8 +1921,8 @@
       <w:rPr>
         <w:rFonts w:ascii="Arial" w:hAnsi="Arial" w:cs="Arial"/>
         <w:color w:val="494A4B"/>
-        <w:sz w:val="18"/>
-        <w:szCs w:val="18"/>
+        <w:sz w:val="16"/>
+        <w:szCs w:val="16"/>
       </w:rPr>
       <w:t xml:space="preserve">Page </w:t>
     </w:r>
@@ -1930,8 +1930,8 @@
       <w:rPr>
         <w:rFonts w:ascii="Arial" w:hAnsi="Arial" w:cs="Arial"/>
         <w:color w:val="494A4B"/>
-        <w:sz w:val="18"/>
-        <w:szCs w:val="18"/>
+        <w:sz w:val="16"/>
+        <w:szCs w:val="16"/>
       </w:rPr>
       <w:fldChar w:fldCharType="begin"/>
     </w:r>
@@ -1939,8 +1939,8 @@
       <w:rPr>
         <w:rFonts w:ascii="Arial" w:hAnsi="Arial" w:cs="Arial"/>
         <w:color w:val="494A4B"/>
-        <w:sz w:val="18"/>
-        <w:szCs w:val="18"/>
+        <w:sz w:val="16"/>
+        <w:szCs w:val="16"/>
       </w:rPr>
       <w:instrText xml:space="preserve"> PAGE </w:instrText>
     </w:r>
@@ -1948,8 +1948,8 @@
       <w:rPr>
         <w:rFonts w:ascii="Arial" w:hAnsi="Arial" w:cs="Arial"/>
         <w:color w:val="494A4B"/>
-        <w:sz w:val="18"/>
-        <w:szCs w:val="18"/>
+        <w:sz w:val="16"/>
+        <w:szCs w:val="16"/>
       </w:rPr>
       <w:fldChar w:fldCharType="separate"/>
     </w:r>
@@ -1957,8 +1957,8 @@
       <w:rPr>
         <w:rFonts w:ascii="Arial" w:hAnsi="Arial" w:cs="Arial"/>
         <w:color w:val="494A4B"/>
-        <w:sz w:val="18"/>
-        <w:szCs w:val="18"/>
+        <w:sz w:val="16"/>
+        <w:szCs w:val="16"/>
       </w:rPr>
       <w:t xml:space="preserve">1</w:t>
     </w:r>
@@ -1966,8 +1966,8 @@
       <w:rPr>
         <w:rFonts w:ascii="Arial" w:hAnsi="Arial" w:cs="Arial"/>
         <w:color w:val="494A4B"/>
-        <w:sz w:val="18"/>
-        <w:szCs w:val="18"/>
+        <w:sz w:val="16"/>
+        <w:szCs w:val="16"/>
       </w:rPr>
       <w:fldChar w:fldCharType="end"/>
     </w:r>
@@ -1975,8 +1975,8 @@
       <w:rPr>
         <w:rFonts w:ascii="Arial" w:hAnsi="Arial" w:cs="Arial"/>
         <w:color w:val="494A4B"/>
-        <w:sz w:val="18"/>
-        <w:szCs w:val="18"/>
+        <w:sz w:val="16"/>
+        <w:szCs w:val="16"/>
       </w:rPr>
       <w:t xml:space="preserve"> of </w:t>
     </w:r>
@@ -1984,8 +1984,8 @@
       <w:rPr>
         <w:rFonts w:ascii="Arial" w:hAnsi="Arial" w:cs="Arial"/>
         <w:color w:val="494A4B"/>
-        <w:sz w:val="18"/>
-        <w:szCs w:val="18"/>
+        <w:sz w:val="16"/>
+        <w:szCs w:val="16"/>
       </w:rPr>
       <w:fldChar w:fldCharType="begin"/>
     </w:r>
@@ -1993,8 +1993,8 @@
       <w:rPr>
         <w:rFonts w:ascii="Arial" w:hAnsi="Arial" w:cs="Arial"/>
         <w:color w:val="494A4B"/>
-        <w:sz w:val="18"/>
-        <w:szCs w:val="18"/>
+        <w:sz w:val="16"/>
+        <w:szCs w:val="16"/>
       </w:rPr>
       <w:instrText xml:space="preserve"> NUMPAGES </w:instrText>
     </w:r>
@@ -2002,8 +2002,8 @@
       <w:rPr>
         <w:rFonts w:ascii="Arial" w:hAnsi="Arial" w:cs="Arial"/>
         <w:color w:val="494A4B"/>
-        <w:sz w:val="18"/>
-        <w:szCs w:val="18"/>
+        <w:sz w:val="16"/>
+        <w:szCs w:val="16"/>
       </w:rPr>
       <w:fldChar w:fldCharType="separate"/>
     </w:r>
@@ -2011,8 +2011,8 @@
       <w:rPr>
         <w:rFonts w:ascii="Arial" w:hAnsi="Arial" w:cs="Arial"/>
         <w:color w:val="494A4B"/>
-        <w:sz w:val="18"/>
-        <w:szCs w:val="18"/>
+        <w:sz w:val="16"/>
+        <w:szCs w:val="16"/>
       </w:rPr>
       <w:t xml:space="preserve">1</w:t>
     </w:r>
@@ -2020,8 +2020,8 @@
       <w:rPr>
         <w:rFonts w:ascii="Arial" w:hAnsi="Arial" w:cs="Arial"/>
         <w:color w:val="494A4B"/>
-        <w:sz w:val="18"/>
-        <w:szCs w:val="18"/>
+        <w:sz w:val="16"/>
+        <w:szCs w:val="16"/>
       </w:rPr>
       <w:fldChar w:fldCharType="end"/>
     </w:r>
@@ -2042,8 +2042,8 @@
       <w:rPr>
         <w:rFonts w:ascii="Arial" w:hAnsi="Arial" w:cs="Arial"/>
         <w:color w:val="494A4B"/>
-        <w:sz w:val="18"/>
-        <w:szCs w:val="18"/>
+        <w:sz w:val="16"/>
+        <w:szCs w:val="16"/>
       </w:rPr>
       <w:t xml:space="preserve">OpenAgreements Confidentiality &amp; Invention Assignment Agreement (CIIAA) (v0.4.0). Free to use under CC BY 4.0</w:t>
     </w:r>
@@ -2054,8 +2054,8 @@
       <w:rPr>
         <w:rFonts w:ascii="Arial" w:hAnsi="Arial" w:cs="Arial"/>
         <w:color w:val="494A4B"/>
-        <w:sz w:val="18"/>
-        <w:szCs w:val="18"/>
+        <w:sz w:val="16"/>
+        <w:szCs w:val="16"/>
       </w:rPr>
       <w:t xml:space="preserve">Page </w:t>
     </w:r>
@@ -2063,8 +2063,8 @@
       <w:rPr>
         <w:rFonts w:ascii="Arial" w:hAnsi="Arial" w:cs="Arial"/>
         <w:color w:val="494A4B"/>
-        <w:sz w:val="18"/>
-        <w:szCs w:val="18"/>
+        <w:sz w:val="16"/>
+        <w:szCs w:val="16"/>
       </w:rPr>
       <w:fldChar w:fldCharType="begin"/>
     </w:r>
@@ -2072,8 +2072,8 @@
       <w:rPr>
         <w:rFonts w:ascii="Arial" w:hAnsi="Arial" w:cs="Arial"/>
         <w:color w:val="494A4B"/>
-        <w:sz w:val="18"/>
-        <w:szCs w:val="18"/>
+        <w:sz w:val="16"/>
+        <w:szCs w:val="16"/>
       </w:rPr>
       <w:instrText xml:space="preserve"> PAGE </w:instrText>
     </w:r>
@@ -2081,8 +2081,8 @@
       <w:rPr>
         <w:rFonts w:ascii="Arial" w:hAnsi="Arial" w:cs="Arial"/>
         <w:color w:val="494A4B"/>
-        <w:sz w:val="18"/>
-        <w:szCs w:val="18"/>
+        <w:sz w:val="16"/>
+        <w:szCs w:val="16"/>
       </w:rPr>
       <w:fldChar w:fldCharType="separate"/>
     </w:r>
@@ -2090,8 +2090,8 @@
       <w:rPr>
         <w:rFonts w:ascii="Arial" w:hAnsi="Arial" w:cs="Arial"/>
         <w:color w:val="494A4B"/>
-        <w:sz w:val="18"/>
-        <w:szCs w:val="18"/>
+        <w:sz w:val="16"/>
+        <w:szCs w:val="16"/>
       </w:rPr>
       <w:t xml:space="preserve">1</w:t>
     </w:r>
@@ -2099,8 +2099,8 @@
       <w:rPr>
         <w:rFonts w:ascii="Arial" w:hAnsi="Arial" w:cs="Arial"/>
         <w:color w:val="494A4B"/>
-        <w:sz w:val="18"/>
-        <w:szCs w:val="18"/>
+        <w:sz w:val="16"/>
+        <w:szCs w:val="16"/>
       </w:rPr>
       <w:fldChar w:fldCharType="end"/>
     </w:r>
@@ -2108,8 +2108,8 @@
       <w:rPr>
         <w:rFonts w:ascii="Arial" w:hAnsi="Arial" w:cs="Arial"/>
         <w:color w:val="494A4B"/>
-        <w:sz w:val="18"/>
-        <w:szCs w:val="18"/>
+        <w:sz w:val="16"/>
+        <w:szCs w:val="16"/>
       </w:rPr>
       <w:t xml:space="preserve"> of </w:t>
     </w:r>
@@ -2117,8 +2117,8 @@
       <w:rPr>
         <w:rFonts w:ascii="Arial" w:hAnsi="Arial" w:cs="Arial"/>
         <w:color w:val="494A4B"/>
-        <w:sz w:val="18"/>
-        <w:szCs w:val="18"/>
+        <w:sz w:val="16"/>
+        <w:szCs w:val="16"/>
       </w:rPr>
       <w:fldChar w:fldCharType="begin"/>
     </w:r>
@@ -2126,8 +2126,8 @@
       <w:rPr>
         <w:rFonts w:ascii="Arial" w:hAnsi="Arial" w:cs="Arial"/>
         <w:color w:val="494A4B"/>
-        <w:sz w:val="18"/>
-        <w:szCs w:val="18"/>
+        <w:sz w:val="16"/>
+        <w:szCs w:val="16"/>
       </w:rPr>
       <w:instrText xml:space="preserve"> NUMPAGES </w:instrText>
     </w:r>
@@ -2135,8 +2135,8 @@
       <w:rPr>
         <w:rFonts w:ascii="Arial" w:hAnsi="Arial" w:cs="Arial"/>
         <w:color w:val="494A4B"/>
-        <w:sz w:val="18"/>
-        <w:szCs w:val="18"/>
+        <w:sz w:val="16"/>
+        <w:szCs w:val="16"/>
       </w:rPr>
       <w:fldChar w:fldCharType="separate"/>
     </w:r>
@@ -2144,8 +2144,8 @@
       <w:rPr>
         <w:rFonts w:ascii="Arial" w:hAnsi="Arial" w:cs="Arial"/>
         <w:color w:val="494A4B"/>
-        <w:sz w:val="18"/>
-        <w:szCs w:val="18"/>
+        <w:sz w:val="16"/>
+        <w:szCs w:val="16"/>
       </w:rPr>
       <w:t xml:space="preserve">1</w:t>
     </w:r>
@@ -2153,8 +2153,8 @@
       <w:rPr>
         <w:rFonts w:ascii="Arial" w:hAnsi="Arial" w:cs="Arial"/>
         <w:color w:val="494A4B"/>
-        <w:sz w:val="18"/>
-        <w:szCs w:val="18"/>
+        <w:sz w:val="16"/>
+        <w:szCs w:val="16"/>
       </w:rPr>
       <w:fldChar w:fldCharType="end"/>
     </w:r>
@@ -2175,8 +2175,8 @@
       <w:rPr>
         <w:rFonts w:ascii="Arial" w:hAnsi="Arial" w:cs="Arial"/>
         <w:color w:val="494A4B"/>
-        <w:sz w:val="18"/>
-        <w:szCs w:val="18"/>
+        <w:sz w:val="16"/>
+        <w:szCs w:val="16"/>
       </w:rPr>
       <w:t xml:space="preserve">OpenAgreements Confidentiality &amp; Invention Assignment Agreement (CIIAA) (v0.4.0). Free to use under CC BY 4.0</w:t>
     </w:r>
@@ -2187,8 +2187,8 @@
       <w:rPr>
         <w:rFonts w:ascii="Arial" w:hAnsi="Arial" w:cs="Arial"/>
         <w:color w:val="494A4B"/>
-        <w:sz w:val="18"/>
-        <w:szCs w:val="18"/>
+        <w:sz w:val="16"/>
+        <w:szCs w:val="16"/>
       </w:rPr>
       <w:t xml:space="preserve">Page </w:t>
     </w:r>
@@ -2196,8 +2196,8 @@
       <w:rPr>
         <w:rFonts w:ascii="Arial" w:hAnsi="Arial" w:cs="Arial"/>
         <w:color w:val="494A4B"/>
-        <w:sz w:val="18"/>
-        <w:szCs w:val="18"/>
+        <w:sz w:val="16"/>
+        <w:szCs w:val="16"/>
       </w:rPr>
       <w:fldChar w:fldCharType="begin"/>
     </w:r>
@@ -2205,8 +2205,8 @@
       <w:rPr>
         <w:rFonts w:ascii="Arial" w:hAnsi="Arial" w:cs="Arial"/>
         <w:color w:val="494A4B"/>
-        <w:sz w:val="18"/>
-        <w:szCs w:val="18"/>
+        <w:sz w:val="16"/>
+        <w:szCs w:val="16"/>
       </w:rPr>
       <w:instrText xml:space="preserve"> PAGE </w:instrText>
     </w:r>
@@ -2214,8 +2214,8 @@
       <w:rPr>
         <w:rFonts w:ascii="Arial" w:hAnsi="Arial" w:cs="Arial"/>
         <w:color w:val="494A4B"/>
-        <w:sz w:val="18"/>
-        <w:szCs w:val="18"/>
+        <w:sz w:val="16"/>
+        <w:szCs w:val="16"/>
       </w:rPr>
       <w:fldChar w:fldCharType="separate"/>
     </w:r>
@@ -2223,8 +2223,8 @@
       <w:rPr>
         <w:rFonts w:ascii="Arial" w:hAnsi="Arial" w:cs="Arial"/>
         <w:color w:val="494A4B"/>
-        <w:sz w:val="18"/>
-        <w:szCs w:val="18"/>
+        <w:sz w:val="16"/>
+        <w:szCs w:val="16"/>
       </w:rPr>
       <w:t xml:space="preserve">1</w:t>
     </w:r>
@@ -2232,8 +2232,8 @@
       <w:rPr>
         <w:rFonts w:ascii="Arial" w:hAnsi="Arial" w:cs="Arial"/>
         <w:color w:val="494A4B"/>
-        <w:sz w:val="18"/>
-        <w:szCs w:val="18"/>
+        <w:sz w:val="16"/>
+        <w:szCs w:val="16"/>
       </w:rPr>
       <w:fldChar w:fldCharType="end"/>
     </w:r>
@@ -2241,8 +2241,8 @@
       <w:rPr>
         <w:rFonts w:ascii="Arial" w:hAnsi="Arial" w:cs="Arial"/>
         <w:color w:val="494A4B"/>
-        <w:sz w:val="18"/>
-        <w:szCs w:val="18"/>
+        <w:sz w:val="16"/>
+        <w:szCs w:val="16"/>
       </w:rPr>
       <w:t xml:space="preserve"> of </w:t>
     </w:r>
@@ -2250,8 +2250,8 @@
       <w:rPr>
         <w:rFonts w:ascii="Arial" w:hAnsi="Arial" w:cs="Arial"/>
         <w:color w:val="494A4B"/>
-        <w:sz w:val="18"/>
-        <w:szCs w:val="18"/>
+        <w:sz w:val="16"/>
+        <w:szCs w:val="16"/>
       </w:rPr>
       <w:fldChar w:fldCharType="begin"/>
     </w:r>
@@ -2259,8 +2259,8 @@
       <w:rPr>
         <w:rFonts w:ascii="Arial" w:hAnsi="Arial" w:cs="Arial"/>
         <w:color w:val="494A4B"/>
-        <w:sz w:val="18"/>
-        <w:szCs w:val="18"/>
+        <w:sz w:val="16"/>
+        <w:szCs w:val="16"/>
       </w:rPr>
       <w:instrText xml:space="preserve"> NUMPAGES </w:instrText>
     </w:r>
@@ -2268,8 +2268,8 @@
       <w:rPr>
         <w:rFonts w:ascii="Arial" w:hAnsi="Arial" w:cs="Arial"/>
         <w:color w:val="494A4B"/>
-        <w:sz w:val="18"/>
-        <w:szCs w:val="18"/>
+        <w:sz w:val="16"/>
+        <w:szCs w:val="16"/>
       </w:rPr>
       <w:fldChar w:fldCharType="separate"/>
     </w:r>
@@ -2277,8 +2277,8 @@
       <w:rPr>
         <w:rFonts w:ascii="Arial" w:hAnsi="Arial" w:cs="Arial"/>
         <w:color w:val="494A4B"/>
-        <w:sz w:val="18"/>
-        <w:szCs w:val="18"/>
+        <w:sz w:val="16"/>
+        <w:szCs w:val="16"/>
       </w:rPr>
       <w:t xml:space="preserve">1</w:t>
     </w:r>
@@ -2286,8 +2286,8 @@
       <w:rPr>
         <w:rFonts w:ascii="Arial" w:hAnsi="Arial" w:cs="Arial"/>
         <w:color w:val="494A4B"/>
-        <w:sz w:val="18"/>
-        <w:szCs w:val="18"/>
+        <w:sz w:val="16"/>
+        <w:szCs w:val="16"/>
       </w:rPr>
       <w:fldChar w:fldCharType="end"/>
     </w:r>

</xml_diff>

<commit_message>
Add APAP interoperability with OpenAgreements CIIAA (#660)
* feat: add APAP CIIAA interoperability

* fix(packaging): ship APAP runtime models

* fix(release): stage resolved package inventory

* fix(docx): style footer paragraphs for Pages
</commit_message>
<xml_diff>
--- a/templates/openagreements-cc-by-4.0/openagreements-confidentiality-invention-assignment-agreement/template.docx
+++ b/templates/openagreements-cc-by-4.0/openagreements-confidentiality-invention-assignment-agreement/template.docx
@@ -1909,8 +1909,8 @@
       <w:rPr>
         <w:rFonts w:ascii="Arial" w:hAnsi="Arial" w:cs="Arial"/>
         <w:color w:val="494A4B"/>
-        <w:sz w:val="18"/>
-        <w:szCs w:val="18"/>
+        <w:sz w:val="16"/>
+        <w:szCs w:val="16"/>
       </w:rPr>
       <w:t xml:space="preserve">OpenAgreements Confidentiality &amp; Invention Assignment Agreement (CIIAA) (v0.4.0). Free to use under CC BY 4.0</w:t>
     </w:r>
@@ -1921,8 +1921,8 @@
       <w:rPr>
         <w:rFonts w:ascii="Arial" w:hAnsi="Arial" w:cs="Arial"/>
         <w:color w:val="494A4B"/>
-        <w:sz w:val="18"/>
-        <w:szCs w:val="18"/>
+        <w:sz w:val="16"/>
+        <w:szCs w:val="16"/>
       </w:rPr>
       <w:t xml:space="preserve">Page </w:t>
     </w:r>
@@ -1930,8 +1930,8 @@
       <w:rPr>
         <w:rFonts w:ascii="Arial" w:hAnsi="Arial" w:cs="Arial"/>
         <w:color w:val="494A4B"/>
-        <w:sz w:val="18"/>
-        <w:szCs w:val="18"/>
+        <w:sz w:val="16"/>
+        <w:szCs w:val="16"/>
       </w:rPr>
       <w:fldChar w:fldCharType="begin"/>
     </w:r>
@@ -1939,8 +1939,8 @@
       <w:rPr>
         <w:rFonts w:ascii="Arial" w:hAnsi="Arial" w:cs="Arial"/>
         <w:color w:val="494A4B"/>
-        <w:sz w:val="18"/>
-        <w:szCs w:val="18"/>
+        <w:sz w:val="16"/>
+        <w:szCs w:val="16"/>
       </w:rPr>
       <w:instrText xml:space="preserve"> PAGE </w:instrText>
     </w:r>
@@ -1948,8 +1948,8 @@
       <w:rPr>
         <w:rFonts w:ascii="Arial" w:hAnsi="Arial" w:cs="Arial"/>
         <w:color w:val="494A4B"/>
-        <w:sz w:val="18"/>
-        <w:szCs w:val="18"/>
+        <w:sz w:val="16"/>
+        <w:szCs w:val="16"/>
       </w:rPr>
       <w:fldChar w:fldCharType="separate"/>
     </w:r>
@@ -1957,8 +1957,8 @@
       <w:rPr>
         <w:rFonts w:ascii="Arial" w:hAnsi="Arial" w:cs="Arial"/>
         <w:color w:val="494A4B"/>
-        <w:sz w:val="18"/>
-        <w:szCs w:val="18"/>
+        <w:sz w:val="16"/>
+        <w:szCs w:val="16"/>
       </w:rPr>
       <w:t xml:space="preserve">1</w:t>
     </w:r>
@@ -1966,8 +1966,8 @@
       <w:rPr>
         <w:rFonts w:ascii="Arial" w:hAnsi="Arial" w:cs="Arial"/>
         <w:color w:val="494A4B"/>
-        <w:sz w:val="18"/>
-        <w:szCs w:val="18"/>
+        <w:sz w:val="16"/>
+        <w:szCs w:val="16"/>
       </w:rPr>
       <w:fldChar w:fldCharType="end"/>
     </w:r>
@@ -1975,8 +1975,8 @@
       <w:rPr>
         <w:rFonts w:ascii="Arial" w:hAnsi="Arial" w:cs="Arial"/>
         <w:color w:val="494A4B"/>
-        <w:sz w:val="18"/>
-        <w:szCs w:val="18"/>
+        <w:sz w:val="16"/>
+        <w:szCs w:val="16"/>
       </w:rPr>
       <w:t xml:space="preserve"> of </w:t>
     </w:r>
@@ -1984,8 +1984,8 @@
       <w:rPr>
         <w:rFonts w:ascii="Arial" w:hAnsi="Arial" w:cs="Arial"/>
         <w:color w:val="494A4B"/>
-        <w:sz w:val="18"/>
-        <w:szCs w:val="18"/>
+        <w:sz w:val="16"/>
+        <w:szCs w:val="16"/>
       </w:rPr>
       <w:fldChar w:fldCharType="begin"/>
     </w:r>
@@ -1993,8 +1993,8 @@
       <w:rPr>
         <w:rFonts w:ascii="Arial" w:hAnsi="Arial" w:cs="Arial"/>
         <w:color w:val="494A4B"/>
-        <w:sz w:val="18"/>
-        <w:szCs w:val="18"/>
+        <w:sz w:val="16"/>
+        <w:szCs w:val="16"/>
       </w:rPr>
       <w:instrText xml:space="preserve"> NUMPAGES </w:instrText>
     </w:r>
@@ -2002,8 +2002,8 @@
       <w:rPr>
         <w:rFonts w:ascii="Arial" w:hAnsi="Arial" w:cs="Arial"/>
         <w:color w:val="494A4B"/>
-        <w:sz w:val="18"/>
-        <w:szCs w:val="18"/>
+        <w:sz w:val="16"/>
+        <w:szCs w:val="16"/>
       </w:rPr>
       <w:fldChar w:fldCharType="separate"/>
     </w:r>
@@ -2011,8 +2011,8 @@
       <w:rPr>
         <w:rFonts w:ascii="Arial" w:hAnsi="Arial" w:cs="Arial"/>
         <w:color w:val="494A4B"/>
-        <w:sz w:val="18"/>
-        <w:szCs w:val="18"/>
+        <w:sz w:val="16"/>
+        <w:szCs w:val="16"/>
       </w:rPr>
       <w:t xml:space="preserve">1</w:t>
     </w:r>
@@ -2020,8 +2020,8 @@
       <w:rPr>
         <w:rFonts w:ascii="Arial" w:hAnsi="Arial" w:cs="Arial"/>
         <w:color w:val="494A4B"/>
-        <w:sz w:val="18"/>
-        <w:szCs w:val="18"/>
+        <w:sz w:val="16"/>
+        <w:szCs w:val="16"/>
       </w:rPr>
       <w:fldChar w:fldCharType="end"/>
     </w:r>
@@ -2042,8 +2042,8 @@
       <w:rPr>
         <w:rFonts w:ascii="Arial" w:hAnsi="Arial" w:cs="Arial"/>
         <w:color w:val="494A4B"/>
-        <w:sz w:val="18"/>
-        <w:szCs w:val="18"/>
+        <w:sz w:val="16"/>
+        <w:szCs w:val="16"/>
       </w:rPr>
       <w:t xml:space="preserve">OpenAgreements Confidentiality &amp; Invention Assignment Agreement (CIIAA) (v0.4.0). Free to use under CC BY 4.0</w:t>
     </w:r>
@@ -2054,8 +2054,8 @@
       <w:rPr>
         <w:rFonts w:ascii="Arial" w:hAnsi="Arial" w:cs="Arial"/>
         <w:color w:val="494A4B"/>
-        <w:sz w:val="18"/>
-        <w:szCs w:val="18"/>
+        <w:sz w:val="16"/>
+        <w:szCs w:val="16"/>
       </w:rPr>
       <w:t xml:space="preserve">Page </w:t>
     </w:r>
@@ -2063,8 +2063,8 @@
       <w:rPr>
         <w:rFonts w:ascii="Arial" w:hAnsi="Arial" w:cs="Arial"/>
         <w:color w:val="494A4B"/>
-        <w:sz w:val="18"/>
-        <w:szCs w:val="18"/>
+        <w:sz w:val="16"/>
+        <w:szCs w:val="16"/>
       </w:rPr>
       <w:fldChar w:fldCharType="begin"/>
     </w:r>
@@ -2072,8 +2072,8 @@
       <w:rPr>
         <w:rFonts w:ascii="Arial" w:hAnsi="Arial" w:cs="Arial"/>
         <w:color w:val="494A4B"/>
-        <w:sz w:val="18"/>
-        <w:szCs w:val="18"/>
+        <w:sz w:val="16"/>
+        <w:szCs w:val="16"/>
       </w:rPr>
       <w:instrText xml:space="preserve"> PAGE </w:instrText>
     </w:r>
@@ -2081,8 +2081,8 @@
       <w:rPr>
         <w:rFonts w:ascii="Arial" w:hAnsi="Arial" w:cs="Arial"/>
         <w:color w:val="494A4B"/>
-        <w:sz w:val="18"/>
-        <w:szCs w:val="18"/>
+        <w:sz w:val="16"/>
+        <w:szCs w:val="16"/>
       </w:rPr>
       <w:fldChar w:fldCharType="separate"/>
     </w:r>
@@ -2090,8 +2090,8 @@
       <w:rPr>
         <w:rFonts w:ascii="Arial" w:hAnsi="Arial" w:cs="Arial"/>
         <w:color w:val="494A4B"/>
-        <w:sz w:val="18"/>
-        <w:szCs w:val="18"/>
+        <w:sz w:val="16"/>
+        <w:szCs w:val="16"/>
       </w:rPr>
       <w:t xml:space="preserve">1</w:t>
     </w:r>
@@ -2099,8 +2099,8 @@
       <w:rPr>
         <w:rFonts w:ascii="Arial" w:hAnsi="Arial" w:cs="Arial"/>
         <w:color w:val="494A4B"/>
-        <w:sz w:val="18"/>
-        <w:szCs w:val="18"/>
+        <w:sz w:val="16"/>
+        <w:szCs w:val="16"/>
       </w:rPr>
       <w:fldChar w:fldCharType="end"/>
     </w:r>
@@ -2108,8 +2108,8 @@
       <w:rPr>
         <w:rFonts w:ascii="Arial" w:hAnsi="Arial" w:cs="Arial"/>
         <w:color w:val="494A4B"/>
-        <w:sz w:val="18"/>
-        <w:szCs w:val="18"/>
+        <w:sz w:val="16"/>
+        <w:szCs w:val="16"/>
       </w:rPr>
       <w:t xml:space="preserve"> of </w:t>
     </w:r>
@@ -2117,8 +2117,8 @@
       <w:rPr>
         <w:rFonts w:ascii="Arial" w:hAnsi="Arial" w:cs="Arial"/>
         <w:color w:val="494A4B"/>
-        <w:sz w:val="18"/>
-        <w:szCs w:val="18"/>
+        <w:sz w:val="16"/>
+        <w:szCs w:val="16"/>
       </w:rPr>
       <w:fldChar w:fldCharType="begin"/>
     </w:r>
@@ -2126,8 +2126,8 @@
       <w:rPr>
         <w:rFonts w:ascii="Arial" w:hAnsi="Arial" w:cs="Arial"/>
         <w:color w:val="494A4B"/>
-        <w:sz w:val="18"/>
-        <w:szCs w:val="18"/>
+        <w:sz w:val="16"/>
+        <w:szCs w:val="16"/>
       </w:rPr>
       <w:instrText xml:space="preserve"> NUMPAGES </w:instrText>
     </w:r>
@@ -2135,8 +2135,8 @@
       <w:rPr>
         <w:rFonts w:ascii="Arial" w:hAnsi="Arial" w:cs="Arial"/>
         <w:color w:val="494A4B"/>
-        <w:sz w:val="18"/>
-        <w:szCs w:val="18"/>
+        <w:sz w:val="16"/>
+        <w:szCs w:val="16"/>
       </w:rPr>
       <w:fldChar w:fldCharType="separate"/>
     </w:r>
@@ -2144,8 +2144,8 @@
       <w:rPr>
         <w:rFonts w:ascii="Arial" w:hAnsi="Arial" w:cs="Arial"/>
         <w:color w:val="494A4B"/>
-        <w:sz w:val="18"/>
-        <w:szCs w:val="18"/>
+        <w:sz w:val="16"/>
+        <w:szCs w:val="16"/>
       </w:rPr>
       <w:t xml:space="preserve">1</w:t>
     </w:r>
@@ -2153,8 +2153,8 @@
       <w:rPr>
         <w:rFonts w:ascii="Arial" w:hAnsi="Arial" w:cs="Arial"/>
         <w:color w:val="494A4B"/>
-        <w:sz w:val="18"/>
-        <w:szCs w:val="18"/>
+        <w:sz w:val="16"/>
+        <w:szCs w:val="16"/>
       </w:rPr>
       <w:fldChar w:fldCharType="end"/>
     </w:r>
@@ -2175,8 +2175,8 @@
       <w:rPr>
         <w:rFonts w:ascii="Arial" w:hAnsi="Arial" w:cs="Arial"/>
         <w:color w:val="494A4B"/>
-        <w:sz w:val="18"/>
-        <w:szCs w:val="18"/>
+        <w:sz w:val="16"/>
+        <w:szCs w:val="16"/>
       </w:rPr>
       <w:t xml:space="preserve">OpenAgreements Confidentiality &amp; Invention Assignment Agreement (CIIAA) (v0.4.0). Free to use under CC BY 4.0</w:t>
     </w:r>
@@ -2187,8 +2187,8 @@
       <w:rPr>
         <w:rFonts w:ascii="Arial" w:hAnsi="Arial" w:cs="Arial"/>
         <w:color w:val="494A4B"/>
-        <w:sz w:val="18"/>
-        <w:szCs w:val="18"/>
+        <w:sz w:val="16"/>
+        <w:szCs w:val="16"/>
       </w:rPr>
       <w:t xml:space="preserve">Page </w:t>
     </w:r>
@@ -2196,8 +2196,8 @@
       <w:rPr>
         <w:rFonts w:ascii="Arial" w:hAnsi="Arial" w:cs="Arial"/>
         <w:color w:val="494A4B"/>
-        <w:sz w:val="18"/>
-        <w:szCs w:val="18"/>
+        <w:sz w:val="16"/>
+        <w:szCs w:val="16"/>
       </w:rPr>
       <w:fldChar w:fldCharType="begin"/>
     </w:r>
@@ -2205,8 +2205,8 @@
       <w:rPr>
         <w:rFonts w:ascii="Arial" w:hAnsi="Arial" w:cs="Arial"/>
         <w:color w:val="494A4B"/>
-        <w:sz w:val="18"/>
-        <w:szCs w:val="18"/>
+        <w:sz w:val="16"/>
+        <w:szCs w:val="16"/>
       </w:rPr>
       <w:instrText xml:space="preserve"> PAGE </w:instrText>
     </w:r>
@@ -2214,8 +2214,8 @@
       <w:rPr>
         <w:rFonts w:ascii="Arial" w:hAnsi="Arial" w:cs="Arial"/>
         <w:color w:val="494A4B"/>
-        <w:sz w:val="18"/>
-        <w:szCs w:val="18"/>
+        <w:sz w:val="16"/>
+        <w:szCs w:val="16"/>
       </w:rPr>
       <w:fldChar w:fldCharType="separate"/>
     </w:r>
@@ -2223,8 +2223,8 @@
       <w:rPr>
         <w:rFonts w:ascii="Arial" w:hAnsi="Arial" w:cs="Arial"/>
         <w:color w:val="494A4B"/>
-        <w:sz w:val="18"/>
-        <w:szCs w:val="18"/>
+        <w:sz w:val="16"/>
+        <w:szCs w:val="16"/>
       </w:rPr>
       <w:t xml:space="preserve">1</w:t>
     </w:r>
@@ -2232,8 +2232,8 @@
       <w:rPr>
         <w:rFonts w:ascii="Arial" w:hAnsi="Arial" w:cs="Arial"/>
         <w:color w:val="494A4B"/>
-        <w:sz w:val="18"/>
-        <w:szCs w:val="18"/>
+        <w:sz w:val="16"/>
+        <w:szCs w:val="16"/>
       </w:rPr>
       <w:fldChar w:fldCharType="end"/>
     </w:r>
@@ -2241,8 +2241,8 @@
       <w:rPr>
         <w:rFonts w:ascii="Arial" w:hAnsi="Arial" w:cs="Arial"/>
         <w:color w:val="494A4B"/>
-        <w:sz w:val="18"/>
-        <w:szCs w:val="18"/>
+        <w:sz w:val="16"/>
+        <w:szCs w:val="16"/>
       </w:rPr>
       <w:t xml:space="preserve"> of </w:t>
     </w:r>
@@ -2250,8 +2250,8 @@
       <w:rPr>
         <w:rFonts w:ascii="Arial" w:hAnsi="Arial" w:cs="Arial"/>
         <w:color w:val="494A4B"/>
-        <w:sz w:val="18"/>
-        <w:szCs w:val="18"/>
+        <w:sz w:val="16"/>
+        <w:szCs w:val="16"/>
       </w:rPr>
       <w:fldChar w:fldCharType="begin"/>
     </w:r>
@@ -2259,8 +2259,8 @@
       <w:rPr>
         <w:rFonts w:ascii="Arial" w:hAnsi="Arial" w:cs="Arial"/>
         <w:color w:val="494A4B"/>
-        <w:sz w:val="18"/>
-        <w:szCs w:val="18"/>
+        <w:sz w:val="16"/>
+        <w:szCs w:val="16"/>
       </w:rPr>
       <w:instrText xml:space="preserve"> NUMPAGES </w:instrText>
     </w:r>
@@ -2268,8 +2268,8 @@
       <w:rPr>
         <w:rFonts w:ascii="Arial" w:hAnsi="Arial" w:cs="Arial"/>
         <w:color w:val="494A4B"/>
-        <w:sz w:val="18"/>
-        <w:szCs w:val="18"/>
+        <w:sz w:val="16"/>
+        <w:szCs w:val="16"/>
       </w:rPr>
       <w:fldChar w:fldCharType="separate"/>
     </w:r>
@@ -2277,8 +2277,8 @@
       <w:rPr>
         <w:rFonts w:ascii="Arial" w:hAnsi="Arial" w:cs="Arial"/>
         <w:color w:val="494A4B"/>
-        <w:sz w:val="18"/>
-        <w:szCs w:val="18"/>
+        <w:sz w:val="16"/>
+        <w:szCs w:val="16"/>
       </w:rPr>
       <w:t xml:space="preserve">1</w:t>
     </w:r>
@@ -2286,8 +2286,8 @@
       <w:rPr>
         <w:rFonts w:ascii="Arial" w:hAnsi="Arial" w:cs="Arial"/>
         <w:color w:val="494A4B"/>
-        <w:sz w:val="18"/>
-        <w:szCs w:val="18"/>
+        <w:sz w:val="16"/>
+        <w:szCs w:val="16"/>
       </w:rPr>
       <w:fldChar w:fldCharType="end"/>
     </w:r>

</xml_diff>

<commit_message>
chore(templates): update contract templates and forms (#704)
Routine refresh of contract template and external-form artifacts and catalog metadata. Contributions are welcome — open an issue or pull request and we'll fold it in.

Co-authored-by: OpenAgreements <noreply@openagreements.org>
Co-authored-by: Steven Obiajulu <steven@usejunior.com>
</commit_message>
<xml_diff>
--- a/templates/openagreements-cc-by-4.0/openagreements-confidentiality-invention-assignment-agreement/template.docx
+++ b/templates/openagreements-cc-by-4.0/openagreements-confidentiality-invention-assignment-agreement/template.docx
@@ -367,6 +367,54 @@
                 <w:sz w:val="22"/>
                 <w:szCs w:val="22"/>
               </w:rPr>
+              <w:t xml:space="preserve">Other Confidential Information Duration</w:t>
+            </w:r>
+          </w:p>
+        </w:tc>
+        <w:tc>
+          <w:tcPr>
+            <w:tcW w:w="6480" w:type="dxa"/>
+            <w:tcMar>
+              <w:top w:w="60" w:type="dxa"/>
+              <w:left w:w="0" w:type="dxa"/>
+              <w:bottom w:w="60" w:type="dxa"/>
+              <w:right w:w="0" w:type="dxa"/>
+            </w:tcMar>
+          </w:tcPr>
+          <w:p>
+            <w:r>
+              <w:rPr>
+                <w:rFonts w:ascii="Arial" w:hAnsi="Arial" w:cs="Arial"/>
+                <w:color w:val="1D2021"/>
+                <w:sz w:val="22"/>
+                <w:szCs w:val="22"/>
+              </w:rPr>
+              <w:t xml:space="preserve">For as long as the information remains confidential, and, where applicable law requires a fixed period, two years after employment ends</w:t>
+            </w:r>
+          </w:p>
+        </w:tc>
+      </w:tr>
+      <w:tr>
+        <w:tc>
+          <w:tcPr>
+            <w:tcW w:w="3600" w:type="dxa"/>
+            <w:tcMar>
+              <w:top w:w="60" w:type="dxa"/>
+              <w:left w:w="0" w:type="dxa"/>
+              <w:bottom w:w="60" w:type="dxa"/>
+              <w:right w:w="0" w:type="dxa"/>
+            </w:tcMar>
+          </w:tcPr>
+          <w:p>
+            <w:r>
+              <w:rPr>
+                <w:rFonts w:ascii="Arial" w:hAnsi="Arial" w:cs="Arial"/>
+                <w:b/>
+                <w:bCs/>
+                <w:color w:val="1D2021"/>
+                <w:sz w:val="22"/>
+                <w:szCs w:val="22"/>
+              </w:rPr>
               <w:t xml:space="preserve">Post-Termination Assistance</w:t>
             </w:r>
           </w:p>
@@ -572,7 +620,7 @@
         <w:t xml:space="preserve">“Confidential Information”</w:t>
       </w:r>
       <w:r>
-        <w:t xml:space="preserve"> means non-public information that Employee learns, accesses, or develops during employment, including business strategies, customer and prospect data, trade secrets, source code, algorithms, security credentials, technical and product information, financial information, personnel information. Confidential Information does not include information that (a) was publicly known when Employee learned it, (b) becomes publicly known through no fault of Employee, (c) was lawfully known to Employee before employment without confidentiality restriction, (d) Employee rightfully receives from a third party without confidentiality restriction, or (e) Employee independently develops outside the scope of employment without using Confidential Information or Company equipment, supplies, facilities, or other resources.</w:t>
+        <w:t xml:space="preserve"> means non-public information of Company that Employee learns, accesses, or develops during employment, including business strategies, customer and prospect data, trade secrets, source code, algorithms, security credentials, technical and product information, financial information, personnel information. Confidential Information also includes non-public information of another person or entity that Employee learns or accesses during employment and that Company has agreed to treat as confidential or that was entrusted to Company in confidence. Confidential Information does not include information that (a) was publicly known when Employee learned it, (b) becomes publicly known through no fault of Employee, (c) was lawfully known to Employee before employment without confidentiality restriction, (d) Employee rightfully receives from a third party without confidentiality restriction, or (e) Employee independently develops outside the scope of employment without using Confidential Information or Company equipment, supplies, facilities, or other resources.</w:t>
       </w:r>
     </w:p>
     <w:p>
@@ -1123,7 +1171,7 @@
         <w:ind w:left="720"/>
       </w:pPr>
       <w:r>
-        <w:t xml:space="preserve">Sections addressing assignment, confidentiality, return of materials, and assistance survive termination to the extent needed to enforce rights that arose during employment. Confidentiality obligations relating to trade secrets survive for so long as the information remains a trade secret under applicable law. This agreement does not transfer ownership of inventions that applicable law requires to remain with Employee.</w:t>
+        <w:t xml:space="preserve">Each obligation in this agreement continues after employment ends for as long as its own stated term provides. Any provision that by its nature should outlast employment survives the end of employment, and rights that arose during employment remain enforceable after it ends. After employment ends, confidentiality obligations relating to Confidential Information other than trade secrets survive for the Other Confidential Information Duration specified in Cover Terms. Confidentiality obligations relating to trade secrets survive for so long as the information remains a trade secret under applicable law. This agreement does not transfer ownership of inventions that applicable law requires to remain with Employee.</w:t>
       </w:r>
     </w:p>
     <w:p>
@@ -1912,7 +1960,7 @@
         <w:sz w:val="16"/>
         <w:szCs w:val="16"/>
       </w:rPr>
-      <w:t xml:space="preserve">OpenAgreements Confidentiality &amp; Invention Assignment Agreement (CIIAA) (v0.4.0). Free to use under CC BY 4.0</w:t>
+      <w:t xml:space="preserve">OpenAgreements Confidentiality &amp; Invention Assignment Agreement (CIIAA) (v0.5.0). Free to use under CC BY 4.0</w:t>
     </w:r>
     <w:r>
       <w:tab/>
@@ -2045,7 +2093,7 @@
         <w:sz w:val="16"/>
         <w:szCs w:val="16"/>
       </w:rPr>
-      <w:t xml:space="preserve">OpenAgreements Confidentiality &amp; Invention Assignment Agreement (CIIAA) (v0.4.0). Free to use under CC BY 4.0</w:t>
+      <w:t xml:space="preserve">OpenAgreements Confidentiality &amp; Invention Assignment Agreement (CIIAA) (v0.5.0). Free to use under CC BY 4.0</w:t>
     </w:r>
     <w:r>
       <w:tab/>
@@ -2178,7 +2226,7 @@
         <w:sz w:val="16"/>
         <w:szCs w:val="16"/>
       </w:rPr>
-      <w:t xml:space="preserve">OpenAgreements Confidentiality &amp; Invention Assignment Agreement (CIIAA) (v0.4.0). Free to use under CC BY 4.0</w:t>
+      <w:t xml:space="preserve">OpenAgreements Confidentiality &amp; Invention Assignment Agreement (CIIAA) (v0.5.0). Free to use under CC BY 4.0</w:t>
     </w:r>
     <w:r>
       <w:tab/>

</xml_diff>